<commit_message>
updated values being displayed
</commit_message>
<xml_diff>
--- a/proj4/report.docx
+++ b/proj4/report.docx
@@ -2184,8 +2184,17 @@
           <w:rStyle w:val="SubtleEmphasis"/>
           <w:lang w:val="en-US" w:eastAsia="ru-RU"/>
         </w:rPr>
-        <w:t xml:space="preserve">  # k iterations</w:t>
-      </w:r>
+        <w:t xml:space="preserve">  # k </w:t>
+      </w:r>
+      <w:proofErr w:type="gramStart"/>
+      <w:r>
+        <w:rPr>
+          <w:rStyle w:val="SubtleEmphasis"/>
+          <w:lang w:val="en-US" w:eastAsia="ru-RU"/>
+        </w:rPr>
+        <w:t>iterations</w:t>
+      </w:r>
+      <w:proofErr w:type="gramEnd"/>
     </w:p>
     <w:p>
       <w:pPr>
@@ -4572,7 +4581,21 @@
         <w:rPr>
           <w:lang w:val="en-US"/>
         </w:rPr>
-        <w:t xml:space="preserve">pointer table to determine the direction of the optimal move: left (“l”), top (“t”), or diagonal (“d”). A diagonal move indicates either a match or substitution, so both characters from the sequences are added to the alignment. A left move represents an insertion (gap in the first sequence), so a “-” is added to the first alignment and the corresponding character from the second sequence is added. A top move represents a deletion (gap in the second sequence), so a character from the first sequence is added and a “-” is added to the second alignment. The indices are updated accordingly after each step, and the process continues until both indices reach zero. Since the alignment is constructed in reverse order, characters are </w:t>
+        <w:t xml:space="preserve">pointer table to determine the direction of the optimal </w:t>
+      </w:r>
+      <w:proofErr w:type="gramStart"/>
+      <w:r>
+        <w:rPr>
+          <w:lang w:val="en-US"/>
+        </w:rPr>
+        <w:t>move:</w:t>
+      </w:r>
+      <w:proofErr w:type="gramEnd"/>
+      <w:r>
+        <w:rPr>
+          <w:lang w:val="en-US"/>
+        </w:rPr>
+        <w:t xml:space="preserve"> left (“l”), top (“t”), or diagonal (“d”). A diagonal move indicates either a match or substitution, so both characters from the sequences are added to the alignment. A left move represents an insertion (gap in the first sequence), so a “-” is added to the first alignment and the corresponding character from the second sequence is added. A top move represents a deletion (gap in the second sequence), so a character from the first sequence is added and a “-” is added to the second alignment. The indices are updated accordingly after each step, and the process continues until both indices reach zero. Since the alignment is constructed in reverse order, characters are </w:t>
       </w:r>
       <w:r>
         <w:rPr>
@@ -4886,16 +4909,47 @@
     <w:p>
       <w:pPr>
         <w:rPr>
-          <w:lang w:val="en-US"/>
-        </w:rPr>
-      </w:pPr>
-      <w:r>
-        <w:rPr>
           <w:rFonts w:cstheme="minorHAnsi"/>
           <w:lang w:val="en-US"/>
         </w:rPr>
+      </w:pPr>
+      <w:r>
+        <w:rPr>
+          <w:rFonts w:cstheme="minorHAnsi"/>
+          <w:lang w:val="en-US"/>
+        </w:rPr>
         <w:t xml:space="preserve">GitHub link: </w:t>
       </w:r>
+    </w:p>
+    <w:p>
+      <w:pPr>
+        <w:rPr>
+          <w:lang w:val="en-US"/>
+        </w:rPr>
+      </w:pPr>
+      <w:hyperlink r:id="rId8" w:history="1">
+        <w:r>
+          <w:rPr>
+            <w:rStyle w:val="Hyperlink"/>
+            <w:lang w:val="en-US"/>
+          </w:rPr>
+          <w:t>AdvancedAlgorithmsCS4412/pro</w:t>
+        </w:r>
+        <w:r>
+          <w:rPr>
+            <w:rStyle w:val="Hyperlink"/>
+            <w:lang w:val="en-US"/>
+          </w:rPr>
+          <w:t>j</w:t>
+        </w:r>
+        <w:r>
+          <w:rPr>
+            <w:rStyle w:val="Hyperlink"/>
+            <w:lang w:val="en-US"/>
+          </w:rPr>
+          <w:t>4 at master · akkabakovb/AdvancedAlgorithmsCS4412</w:t>
+        </w:r>
+      </w:hyperlink>
     </w:p>
     <w:p>
       <w:pPr>
@@ -6316,7 +6370,6 @@
   <w:style w:type="character" w:default="1" w:styleId="DefaultParagraphFont">
     <w:name w:val="Default Paragraph Font"/>
     <w:uiPriority w:val="1"/>
-    <w:semiHidden/>
     <w:unhideWhenUsed/>
   </w:style>
   <w:style w:type="table" w:default="1" w:styleId="TableNormal">
@@ -6681,6 +6734,30 @@
       <w14:ligatures w14:val="none"/>
     </w:rPr>
   </w:style>
+  <w:style w:type="character" w:styleId="UnresolvedMention">
+    <w:name w:val="Unresolved Mention"/>
+    <w:basedOn w:val="DefaultParagraphFont"/>
+    <w:uiPriority w:val="99"/>
+    <w:semiHidden/>
+    <w:unhideWhenUsed/>
+    <w:rsid w:val="000A6257"/>
+    <w:rPr>
+      <w:color w:val="605E5C"/>
+      <w:shd w:val="clear" w:color="auto" w:fill="E1DFDD"/>
+    </w:rPr>
+  </w:style>
+  <w:style w:type="character" w:styleId="FollowedHyperlink">
+    <w:name w:val="FollowedHyperlink"/>
+    <w:basedOn w:val="DefaultParagraphFont"/>
+    <w:uiPriority w:val="99"/>
+    <w:semiHidden/>
+    <w:unhideWhenUsed/>
+    <w:rsid w:val="000A6257"/>
+    <w:rPr>
+      <w:color w:val="954F72" w:themeColor="followedHyperlink"/>
+      <w:u w:val="single"/>
+    </w:rPr>
+  </w:style>
 </w:styles>
 </file>
 

</xml_diff>